<commit_message>
docs: UAT log, as-built reconciliation, and conversational-upgrade plan
- UAT.md: living UAT issue/finding log + new requirements (FR40-42)
- Implemented_Req_Design.md: requirements/design reconciled against
  the source docs and the as-built deployment
- Requirements v2.4 .docx: Addendum v2.4.2 (FR40-42 from UAT)
- Conversational-upgrade spec (both revisions) + final reconciled
  mockup (conversation-first home, plan/action cards, memory view)
- Revised_Imple_Plan.md: approved 8-phase plan for FR43-48 / NFR-10-11

Documentation only; no app code changes. Phase 1 not started.

Co-Authored-By: Claude Opus 4.8 (1M context) <noreply@anthropic.com>
Claude-Session: https://claude.ai/code/session_01J5ApTeXdJ1jAGZpWi4BX2s
</commit_message>
<xml_diff>
--- a/Req_Design Docs/PersonalChiefOfStaff_Requirements_FINAL_v2.4.docx
+++ b/Req_Design Docs/PersonalChiefOfStaff_Requirements_FINAL_v2.4.docx
@@ -16000,6 +16000,58 @@
     <w:p>
       <w:r>
         <w:t xml:space="preserve">The users entity gains a theme attribute (for example 'aurora' = blue / violet / green for User A, 'sunrise' = yellow / white / orange for User B), defaulted per user and stored alongside the synced Clerk profile.</w:t>
+      </w:r>
+    </w:p>
+    <w:p>
+      <w:r>
+        <w:br w:type="page"/>
+      </w:r>
+    </w:p>
+    <w:p>
+      <w:r>
+        <w:rPr>
+          <w:b/>
+          <w:sz w:val="26"/>
+        </w:rPr>
+        <w:t>Addendum v2.4.2 - New Requirements based on UAT (added 2026-06-29)</w:t>
+      </w:r>
+    </w:p>
+    <w:p>
+      <w:r>
+        <w:t>Requirements raised during user acceptance testing of the deployed build (https://personal-cos.vercel.app). Each is flagged (new, UAT) and tracked with full status in UAT.md at the repository root.</w:t>
+      </w:r>
+    </w:p>
+    <w:p>
+      <w:r>
+        <w:rPr>
+          <w:b/>
+        </w:rPr>
+        <w:t xml:space="preserve">FR40 (new, UAT) - </w:t>
+      </w:r>
+      <w:r>
+        <w:t>Natural-language due-date extraction at capture. System: Capture / Calendar. Priority: M. Status: Implemented (commit ae92c2a). Capture parses dates and times from the original text (e.g. 'by July 5, 2026', '7-8pm', 'tomorrow', 'friday', 'in 3 days', ISO) and sets the task due date, so dated captures appear on the calendar. Deterministic; identical online and offline.</w:t>
+      </w:r>
+    </w:p>
+    <w:p>
+      <w:r>
+        <w:rPr>
+          <w:b/>
+        </w:rPr>
+        <w:t xml:space="preserve">FR41 (new, UAT) - </w:t>
+      </w:r>
+      <w:r>
+        <w:t>Default deadline time for date-only captures. System: Capture / Calendar. Priority: M. Status: Implemented (commit 38bb305). A capture with a date but no explicit time defaults to a 9pm (21:00) deadline, so date-only deadline tasks (bills, rent, credit-card payments) surface as a timed 'due by' activity rather than an all-day block.</w:t>
+      </w:r>
+    </w:p>
+    <w:p>
+      <w:r>
+        <w:rPr>
+          <w:b/>
+        </w:rPr>
+        <w:t xml:space="preserve">FR42 (new, UAT) - </w:t>
+      </w:r>
+      <w:r>
+        <w:t>Per-user timezone-aware date/time handling. System: Platform. Priority: M. Status: Open (Stage D). Parse, store, display, and schedule reminders using each user's users.timezone instead of server-local / UTC. Current behaviour renders all times in UTC.</w:t>
       </w:r>
     </w:p>
     <w:sectPr>

</xml_diff>